<commit_message>
add pdf and word files for AMG Executive Memo
</commit_message>
<xml_diff>
--- a/AMG_Executive_Memo.docx
+++ b/AMG_Executive_Memo.docx
@@ -4,7 +4,7 @@
   <w:body>
     <w:p>
       <w:pPr>
-        <w:spacing w:line="276" w:lineRule="auto"/>
+        <w:spacing w:line="240" w:lineRule="auto"/>
         <w:jc w:val="center"/>
         <w:rPr>
           <w:rFonts w:eastAsiaTheme="minorEastAsia"/>
@@ -90,7 +90,7 @@
           </mc:Choice>
           <mc:Fallback>
             <w:pict>
-              <v:line w14:anchorId="70A008F8" id="Straight Connector 5" o:spid="_x0000_s1026" style="position:absolute;flip:y;z-index:251659264;visibility:visible;mso-wrap-style:square;mso-wrap-distance-left:9pt;mso-wrap-distance-top:0;mso-wrap-distance-right:9pt;mso-wrap-distance-bottom:0;mso-position-horizontal:absolute;mso-position-horizontal-relative:text;mso-position-vertical:absolute;mso-position-vertical-relative:text" from="-.5pt,15.05pt" to="468.5pt,16.55pt" o:gfxdata="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" strokecolor="black [3213]" strokeweight="1pt">
+              <v:line w14:anchorId="290E31AD" id="Straight Connector 5" o:spid="_x0000_s1026" style="position:absolute;flip:y;z-index:251659264;visibility:visible;mso-wrap-style:square;mso-wrap-distance-left:9pt;mso-wrap-distance-top:0;mso-wrap-distance-right:9pt;mso-wrap-distance-bottom:0;mso-position-horizontal:absolute;mso-position-horizontal-relative:text;mso-position-vertical:absolute;mso-position-vertical-relative:text" from="-.5pt,15.05pt" to="468.5pt,16.55pt" o:gfxdata="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" strokecolor="black [3213]" strokeweight="1pt">
                 <v:stroke joinstyle="miter"/>
               </v:line>
             </w:pict>
@@ -100,7 +100,7 @@
     </w:p>
     <w:p>
       <w:pPr>
-        <w:spacing w:after="40" w:line="276" w:lineRule="auto"/>
+        <w:spacing w:after="40" w:line="240" w:lineRule="auto"/>
       </w:pPr>
       <w:r>
         <w:rPr>
@@ -125,7 +125,7 @@
     </w:p>
     <w:p>
       <w:pPr>
-        <w:spacing w:after="40" w:line="276" w:lineRule="auto"/>
+        <w:spacing w:after="40" w:line="240" w:lineRule="auto"/>
       </w:pPr>
       <w:r>
         <w:rPr>
@@ -159,7 +159,7 @@
     </w:p>
     <w:p>
       <w:pPr>
-        <w:spacing w:after="40" w:line="276" w:lineRule="auto"/>
+        <w:spacing w:after="40" w:line="240" w:lineRule="auto"/>
       </w:pPr>
       <w:r>
         <w:rPr>
@@ -184,7 +184,7 @@
     </w:p>
     <w:p>
       <w:pPr>
-        <w:spacing w:after="40" w:line="276" w:lineRule="auto"/>
+        <w:spacing w:after="40" w:line="240" w:lineRule="auto"/>
       </w:pPr>
       <w:r>
         <w:rPr>
@@ -210,7 +210,7 @@
     <w:p>
       <w:pPr>
         <w:pStyle w:val="Heading1"/>
-        <w:spacing w:before="320" w:after="140" w:line="276" w:lineRule="auto"/>
+        <w:spacing w:before="320" w:after="140" w:line="240" w:lineRule="auto"/>
       </w:pPr>
       <w:r>
         <w:rPr>
@@ -277,7 +277,7 @@
           </mc:Choice>
           <mc:Fallback>
             <w:pict>
-              <v:line w14:anchorId="6F6373EC" id="Straight Connector 5" o:spid="_x0000_s1026" style="position:absolute;flip:y;z-index:251661312;visibility:visible;mso-wrap-style:square;mso-wrap-distance-left:9pt;mso-wrap-distance-top:0;mso-wrap-distance-right:9pt;mso-wrap-distance-bottom:0;mso-position-horizontal:left;mso-position-horizontal-relative:margin;mso-position-vertical:absolute;mso-position-vertical-relative:text" from="0,3.7pt" to="469pt,5.2pt" o:gfxdata="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" strokecolor="black [3213]" strokeweight="1pt">
+              <v:line w14:anchorId="27A671E2" id="Straight Connector 5" o:spid="_x0000_s1026" style="position:absolute;flip:y;z-index:251661312;visibility:visible;mso-wrap-style:square;mso-wrap-distance-left:9pt;mso-wrap-distance-top:0;mso-wrap-distance-right:9pt;mso-wrap-distance-bottom:0;mso-position-horizontal:left;mso-position-horizontal-relative:margin;mso-position-vertical:absolute;mso-position-vertical-relative:text" from="0,3.7pt" to="469pt,5.2pt" o:gfxdata="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" strokecolor="black [3213]" strokeweight="1pt">
                 <v:stroke joinstyle="miter"/>
                 <w10:wrap anchorx="margin"/>
               </v:line>
@@ -299,22 +299,42 @@
     </w:p>
     <w:p>
       <w:pPr>
-        <w:spacing w:line="276" w:lineRule="auto"/>
-        <w:rPr>
-          <w:rFonts w:ascii="Calibri" w:eastAsia="Calibri" w:hAnsi="Calibri" w:cs="Calibri"/>
-          <w:color w:val="222222"/>
-          <w:sz w:val="22"/>
-          <w:szCs w:val="22"/>
-        </w:rPr>
-      </w:pPr>
-      <w:r>
-        <w:rPr>
-          <w:rFonts w:ascii="Calibri" w:eastAsia="Calibri" w:hAnsi="Calibri" w:cs="Calibri"/>
-          <w:color w:val="222222"/>
-          <w:sz w:val="22"/>
-          <w:szCs w:val="22"/>
-        </w:rPr>
-        <w:t xml:space="preserve">The engineering BOM system and the main ERP are two distinct databases connected by a nightly sync that frequently fails, which is the same primary cause of AMG's manufacturing delays and margin loss on special orders. Leadership is unable to view contribution margin while a job is ongoing since labour monitoring and job costing are located outside of both systems. In order to maintain month-end </w:t>
+        <w:spacing w:line="240" w:lineRule="auto"/>
+        <w:rPr>
+          <w:rFonts w:ascii="Calibri" w:eastAsia="Calibri" w:hAnsi="Calibri" w:cs="Calibri"/>
+          <w:color w:val="222222"/>
+          <w:sz w:val="22"/>
+          <w:szCs w:val="22"/>
+        </w:rPr>
+      </w:pPr>
+      <w:r>
+        <w:rPr>
+          <w:rFonts w:ascii="Calibri" w:eastAsia="Calibri" w:hAnsi="Calibri" w:cs="Calibri"/>
+          <w:color w:val="222222"/>
+          <w:sz w:val="22"/>
+          <w:szCs w:val="22"/>
+        </w:rPr>
+        <w:t xml:space="preserve">The engineering BOM system and the main ERP are two distinct databases connected by a nightly sync that frequently fails, which is the same primary cause of AMG's manufacturing delays and margin loss on special orders. Leadership is unable to view contribution margin while a job is ongoing since labour monitoring and job costing are located outside of both systems. </w:t>
+      </w:r>
+      <w:proofErr w:type="gramStart"/>
+      <w:r>
+        <w:rPr>
+          <w:rFonts w:ascii="Calibri" w:eastAsia="Calibri" w:hAnsi="Calibri" w:cs="Calibri"/>
+          <w:color w:val="222222"/>
+          <w:sz w:val="22"/>
+          <w:szCs w:val="22"/>
+        </w:rPr>
+        <w:t>In order to</w:t>
+      </w:r>
+      <w:proofErr w:type="gramEnd"/>
+      <w:r>
+        <w:rPr>
+          <w:rFonts w:ascii="Calibri" w:eastAsia="Calibri" w:hAnsi="Calibri" w:cs="Calibri"/>
+          <w:color w:val="222222"/>
+          <w:sz w:val="22"/>
+          <w:szCs w:val="22"/>
+        </w:rPr>
+        <w:t xml:space="preserve"> maintain month-end </w:t>
       </w:r>
       <w:r>
         <w:rPr>
@@ -334,15 +354,17 @@
         </w:rPr>
         <w:t xml:space="preserve"> and KPI reporting throughout the twelve-month program, this letter suggests a phased, pilot-first ERP replacement </w:t>
       </w:r>
-      <w:r>
-        <w:rPr>
-          <w:rFonts w:ascii="Calibri" w:eastAsia="Calibri" w:hAnsi="Calibri" w:cs="Calibri"/>
-          <w:color w:val="222222"/>
-          <w:sz w:val="22"/>
-          <w:szCs w:val="22"/>
-        </w:rPr>
-        <w:t>centered</w:t>
-      </w:r>
+      <w:proofErr w:type="spellStart"/>
+      <w:r>
+        <w:rPr>
+          <w:rFonts w:ascii="Calibri" w:eastAsia="Calibri" w:hAnsi="Calibri" w:cs="Calibri"/>
+          <w:color w:val="222222"/>
+          <w:sz w:val="22"/>
+          <w:szCs w:val="22"/>
+        </w:rPr>
+        <w:t>centred</w:t>
+      </w:r>
+      <w:proofErr w:type="spellEnd"/>
       <w:r>
         <w:rPr>
           <w:rFonts w:ascii="Calibri" w:eastAsia="Calibri" w:hAnsi="Calibri" w:cs="Calibri"/>
@@ -352,6 +374,17 @@
         </w:rPr>
         <w:t xml:space="preserve"> around three objectives, a rigorous Day-1 scope, and a two-tier approach to historical data.</w:t>
       </w:r>
+    </w:p>
+    <w:p>
+      <w:pPr>
+        <w:spacing w:line="240" w:lineRule="auto"/>
+        <w:rPr>
+          <w:rFonts w:ascii="Calibri" w:eastAsia="Calibri" w:hAnsi="Calibri" w:cs="Calibri"/>
+          <w:color w:val="222222"/>
+          <w:sz w:val="22"/>
+          <w:szCs w:val="22"/>
+        </w:rPr>
+      </w:pPr>
       <w:r>
         <w:rPr>
           <w:rFonts w:ascii="Calibri" w:eastAsia="Calibri" w:hAnsi="Calibri" w:cs="Calibri"/>
@@ -376,7 +409,7 @@
     <w:p>
       <w:pPr>
         <w:pStyle w:val="Heading2"/>
-        <w:spacing w:before="200" w:after="100" w:line="276" w:lineRule="auto"/>
+        <w:spacing w:before="200" w:after="100" w:line="240" w:lineRule="auto"/>
       </w:pPr>
       <w:r>
         <w:rPr>
@@ -400,7 +433,7 @@
         <w:tabs>
           <w:tab w:val="decimal" w:pos="360"/>
         </w:tabs>
-        <w:spacing w:after="90" w:line="276" w:lineRule="auto"/>
+        <w:spacing w:after="90" w:line="240" w:lineRule="auto"/>
         <w:ind w:left="270" w:hanging="180"/>
         <w:rPr>
           <w:rFonts w:ascii="Calibri" w:eastAsia="Calibri" w:hAnsi="Calibri" w:cs="Calibri"/>
@@ -440,7 +473,7 @@
         <w:tabs>
           <w:tab w:val="decimal" w:pos="360"/>
         </w:tabs>
-        <w:spacing w:after="90" w:line="276" w:lineRule="auto"/>
+        <w:spacing w:after="90" w:line="240" w:lineRule="auto"/>
         <w:ind w:left="270" w:hanging="180"/>
         <w:contextualSpacing w:val="0"/>
       </w:pPr>
@@ -472,7 +505,7 @@
           <w:ilvl w:val="0"/>
           <w:numId w:val="1"/>
         </w:numPr>
-        <w:spacing w:after="90" w:line="276" w:lineRule="auto"/>
+        <w:spacing w:after="90" w:line="240" w:lineRule="auto"/>
         <w:ind w:left="270" w:hanging="180"/>
         <w:contextualSpacing w:val="0"/>
       </w:pPr>
@@ -500,7 +533,7 @@
     <w:p>
       <w:pPr>
         <w:pStyle w:val="Heading2"/>
-        <w:spacing w:before="0" w:after="100" w:line="276" w:lineRule="auto"/>
+        <w:spacing w:before="0" w:after="100" w:line="240" w:lineRule="auto"/>
         <w:ind w:firstLine="90"/>
       </w:pPr>
       <w:r>
@@ -517,7 +550,7 @@
     </w:p>
     <w:p>
       <w:pPr>
-        <w:spacing w:line="276" w:lineRule="auto"/>
+        <w:spacing w:line="240" w:lineRule="auto"/>
         <w:ind w:left="270"/>
       </w:pPr>
       <w:r>
@@ -564,7 +597,7 @@
           <w:ilvl w:val="0"/>
           <w:numId w:val="4"/>
         </w:numPr>
-        <w:spacing w:line="276" w:lineRule="auto"/>
+        <w:spacing w:line="240" w:lineRule="auto"/>
       </w:pPr>
       <w:r>
         <w:rPr>
@@ -612,7 +645,7 @@
           <w:ilvl w:val="0"/>
           <w:numId w:val="4"/>
         </w:numPr>
-        <w:spacing w:line="276" w:lineRule="auto"/>
+        <w:spacing w:line="240" w:lineRule="auto"/>
       </w:pPr>
       <w:r>
         <w:rPr>
@@ -660,7 +693,7 @@
           <w:ilvl w:val="0"/>
           <w:numId w:val="4"/>
         </w:numPr>
-        <w:spacing w:line="276" w:lineRule="auto"/>
+        <w:spacing w:line="240" w:lineRule="auto"/>
       </w:pPr>
       <w:r>
         <w:rPr>
@@ -690,7 +723,7 @@
           <w:ilvl w:val="0"/>
           <w:numId w:val="4"/>
         </w:numPr>
-        <w:spacing w:line="276" w:lineRule="auto"/>
+        <w:spacing w:line="240" w:lineRule="auto"/>
       </w:pPr>
       <w:r>
         <w:rPr>
@@ -733,7 +766,7 @@
     </w:p>
     <w:p>
       <w:pPr>
-        <w:spacing w:line="276" w:lineRule="auto"/>
+        <w:spacing w:line="240" w:lineRule="auto"/>
         <w:ind w:left="360"/>
         <w:rPr>
           <w:rFonts w:ascii="Calibri" w:eastAsia="Calibri" w:hAnsi="Calibri" w:cs="Calibri"/>
@@ -755,7 +788,7 @@
     <w:p>
       <w:pPr>
         <w:pStyle w:val="Heading2"/>
-        <w:spacing w:before="200" w:after="100" w:line="276" w:lineRule="auto"/>
+        <w:spacing w:before="200" w:after="100" w:line="240" w:lineRule="auto"/>
       </w:pPr>
       <w:r>
         <w:rPr>
@@ -766,46 +799,37 @@
           <w:sz w:val="23"/>
           <w:szCs w:val="23"/>
         </w:rPr>
-        <w:lastRenderedPageBreak/>
         <w:t>Scope Control</w:t>
       </w:r>
     </w:p>
     <w:p>
       <w:pPr>
-        <w:spacing w:line="276" w:lineRule="auto"/>
-      </w:pPr>
-      <w:r>
-        <w:rPr>
-          <w:rFonts w:ascii="Calibri" w:eastAsia="Calibri" w:hAnsi="Calibri" w:cs="Calibri"/>
-          <w:color w:val="222222"/>
-          <w:sz w:val="22"/>
-          <w:szCs w:val="22"/>
-        </w:rPr>
-        <w:t>A change control board is established from Month 1. Every requested addition to scope, whether a customization, a new interface, or a process change, is logged and evaluated against the three program</w:t>
-      </w:r>
-      <w:r>
-        <w:rPr>
-          <w:rFonts w:ascii="Calibri" w:eastAsia="Calibri" w:hAnsi="Calibri" w:cs="Calibri"/>
-          <w:color w:val="222222"/>
-          <w:sz w:val="22"/>
-          <w:szCs w:val="22"/>
-        </w:rPr>
-        <w:t xml:space="preserve"> </w:t>
-      </w:r>
-      <w:r>
-        <w:rPr>
-          <w:rFonts w:ascii="Calibri" w:eastAsia="Calibri" w:hAnsi="Calibri" w:cs="Calibri"/>
-          <w:color w:val="222222"/>
-          <w:sz w:val="22"/>
-          <w:szCs w:val="22"/>
-        </w:rPr>
+        <w:spacing w:line="240" w:lineRule="auto"/>
+      </w:pPr>
+      <w:r>
+        <w:rPr>
+          <w:rFonts w:ascii="Calibri" w:eastAsia="Calibri" w:hAnsi="Calibri" w:cs="Calibri"/>
+          <w:color w:val="222222"/>
+          <w:sz w:val="22"/>
+          <w:szCs w:val="22"/>
+        </w:rPr>
+        <w:t xml:space="preserve">A change control board is established from Month 1. Every requested addition to scope, whether a customization, a new interface, or a process change, is logged and evaluated against the three program </w:t>
+      </w:r>
+      <w:r>
+        <w:rPr>
+          <w:rFonts w:ascii="Calibri" w:eastAsia="Calibri" w:hAnsi="Calibri" w:cs="Calibri"/>
+          <w:color w:val="222222"/>
+          <w:sz w:val="22"/>
+          <w:szCs w:val="22"/>
+        </w:rPr>
+        <w:lastRenderedPageBreak/>
         <w:t>objectives above. If a request does not clearly serve margin visibility, sync elimination, or core consolidation, it is deferred to a post-go-live phase rather than added mid-build. This is the mechanism that keeps an engineer-to-order implementation, which naturally invites edge cases and one-off requirements, inside a twelve-month window.</w:t>
       </w:r>
     </w:p>
     <w:p>
       <w:pPr>
         <w:pStyle w:val="Heading2"/>
-        <w:spacing w:before="200" w:after="100" w:line="276" w:lineRule="auto"/>
+        <w:spacing w:before="200" w:after="100" w:line="240" w:lineRule="auto"/>
         <w:rPr>
           <w:rFonts w:ascii="Cambria" w:eastAsia="Cambria" w:hAnsi="Cambria" w:cs="Cambria"/>
           <w:b/>
@@ -829,7 +853,7 @@
     </w:p>
     <w:tbl>
       <w:tblPr>
-        <w:tblW w:w="9862" w:type="dxa"/>
+        <w:tblW w:w="10064" w:type="dxa"/>
         <w:tblInd w:w="-5" w:type="dxa"/>
         <w:tblBorders>
           <w:top w:val="single" w:sz="4" w:space="0" w:color="auto"/>
@@ -846,9 +870,9 @@
         <w:tblLook w:val="0000" w:firstRow="0" w:lastRow="0" w:firstColumn="0" w:lastColumn="0" w:noHBand="0" w:noVBand="0"/>
       </w:tblPr>
       <w:tblGrid>
-        <w:gridCol w:w="2029"/>
-        <w:gridCol w:w="3182"/>
-        <w:gridCol w:w="4651"/>
+        <w:gridCol w:w="2071"/>
+        <w:gridCol w:w="3247"/>
+        <w:gridCol w:w="4746"/>
       </w:tblGrid>
       <w:tr>
         <w:tblPrEx>
@@ -858,13 +882,13 @@
           </w:tblCellMar>
         </w:tblPrEx>
         <w:trPr>
-          <w:trHeight w:val="32"/>
+          <w:trHeight w:val="40"/>
           <w:tblHeader/>
         </w:trPr>
         <w:tc>
           <w:tcPr>
-            <w:tcW w:w="2029" w:type="dxa"/>
-            <w:shd w:val="clear" w:color="auto" w:fill="E97132" w:themeFill="accent2"/>
+            <w:tcW w:w="2071" w:type="dxa"/>
+            <w:shd w:val="clear" w:color="auto" w:fill="ADADAD" w:themeFill="background2" w:themeFillShade="BF"/>
             <w:tcMar>
               <w:top w:w="90" w:type="dxa"/>
               <w:left w:w="110" w:type="dxa"/>
@@ -874,7 +898,8 @@
           </w:tcPr>
           <w:p>
             <w:pPr>
-              <w:spacing w:line="276" w:lineRule="auto"/>
+              <w:spacing w:line="240" w:lineRule="auto"/>
+              <w:jc w:val="center"/>
             </w:pPr>
             <w:r>
               <w:rPr>
@@ -891,8 +916,8 @@
         </w:tc>
         <w:tc>
           <w:tcPr>
-            <w:tcW w:w="3182" w:type="dxa"/>
-            <w:shd w:val="clear" w:color="auto" w:fill="E97132" w:themeFill="accent2"/>
+            <w:tcW w:w="3247" w:type="dxa"/>
+            <w:shd w:val="clear" w:color="auto" w:fill="ADADAD" w:themeFill="background2" w:themeFillShade="BF"/>
             <w:tcMar>
               <w:top w:w="90" w:type="dxa"/>
               <w:left w:w="110" w:type="dxa"/>
@@ -902,7 +927,8 @@
           </w:tcPr>
           <w:p>
             <w:pPr>
-              <w:spacing w:line="276" w:lineRule="auto"/>
+              <w:spacing w:line="240" w:lineRule="auto"/>
+              <w:jc w:val="center"/>
             </w:pPr>
             <w:r>
               <w:rPr>
@@ -919,8 +945,8 @@
         </w:tc>
         <w:tc>
           <w:tcPr>
-            <w:tcW w:w="4651" w:type="dxa"/>
-            <w:shd w:val="clear" w:color="auto" w:fill="E97132" w:themeFill="accent2"/>
+            <w:tcW w:w="4746" w:type="dxa"/>
+            <w:shd w:val="clear" w:color="auto" w:fill="ADADAD" w:themeFill="background2" w:themeFillShade="BF"/>
             <w:tcMar>
               <w:top w:w="90" w:type="dxa"/>
               <w:left w:w="110" w:type="dxa"/>
@@ -930,7 +956,8 @@
           </w:tcPr>
           <w:p>
             <w:pPr>
-              <w:spacing w:line="276" w:lineRule="auto"/>
+              <w:spacing w:line="240" w:lineRule="auto"/>
+              <w:jc w:val="center"/>
             </w:pPr>
             <w:r>
               <w:rPr>
@@ -954,11 +981,11 @@
           </w:tblCellMar>
         </w:tblPrEx>
         <w:trPr>
-          <w:trHeight w:val="77"/>
+          <w:trHeight w:val="94"/>
         </w:trPr>
         <w:tc>
           <w:tcPr>
-            <w:tcW w:w="2029" w:type="dxa"/>
+            <w:tcW w:w="2071" w:type="dxa"/>
             <w:shd w:val="clear" w:color="auto" w:fill="F2F4F7"/>
             <w:tcMar>
               <w:top w:w="90" w:type="dxa"/>
@@ -969,7 +996,7 @@
           </w:tcPr>
           <w:p>
             <w:pPr>
-              <w:spacing w:line="276" w:lineRule="auto"/>
+              <w:spacing w:line="240" w:lineRule="auto"/>
             </w:pPr>
             <w:r>
               <w:rPr>
@@ -984,7 +1011,7 @@
         </w:tc>
         <w:tc>
           <w:tcPr>
-            <w:tcW w:w="3182" w:type="dxa"/>
+            <w:tcW w:w="3247" w:type="dxa"/>
             <w:shd w:val="clear" w:color="auto" w:fill="FFFFFF"/>
             <w:tcMar>
               <w:top w:w="90" w:type="dxa"/>
@@ -995,7 +1022,7 @@
           </w:tcPr>
           <w:p>
             <w:pPr>
-              <w:spacing w:line="276" w:lineRule="auto"/>
+              <w:spacing w:line="240" w:lineRule="auto"/>
             </w:pPr>
             <w:r>
               <w:rPr>
@@ -1028,7 +1055,7 @@
         </w:tc>
         <w:tc>
           <w:tcPr>
-            <w:tcW w:w="4651" w:type="dxa"/>
+            <w:tcW w:w="4746" w:type="dxa"/>
             <w:shd w:val="clear" w:color="auto" w:fill="FFFFFF"/>
             <w:tcMar>
               <w:top w:w="90" w:type="dxa"/>
@@ -1039,7 +1066,7 @@
           </w:tcPr>
           <w:p>
             <w:pPr>
-              <w:spacing w:line="276" w:lineRule="auto"/>
+              <w:spacing w:line="240" w:lineRule="auto"/>
             </w:pPr>
             <w:r>
               <w:rPr>
@@ -1061,11 +1088,11 @@
           </w:tblCellMar>
         </w:tblPrEx>
         <w:trPr>
-          <w:trHeight w:val="77"/>
+          <w:trHeight w:val="94"/>
         </w:trPr>
         <w:tc>
           <w:tcPr>
-            <w:tcW w:w="2029" w:type="dxa"/>
+            <w:tcW w:w="2071" w:type="dxa"/>
             <w:shd w:val="clear" w:color="auto" w:fill="F2F4F7"/>
             <w:tcMar>
               <w:top w:w="90" w:type="dxa"/>
@@ -1076,7 +1103,7 @@
           </w:tcPr>
           <w:p>
             <w:pPr>
-              <w:spacing w:line="276" w:lineRule="auto"/>
+              <w:spacing w:line="240" w:lineRule="auto"/>
             </w:pPr>
             <w:r>
               <w:rPr>
@@ -1091,7 +1118,7 @@
         </w:tc>
         <w:tc>
           <w:tcPr>
-            <w:tcW w:w="3182" w:type="dxa"/>
+            <w:tcW w:w="3247" w:type="dxa"/>
             <w:shd w:val="clear" w:color="auto" w:fill="FFFFFF"/>
             <w:tcMar>
               <w:top w:w="90" w:type="dxa"/>
@@ -1102,7 +1129,7 @@
           </w:tcPr>
           <w:p>
             <w:pPr>
-              <w:spacing w:line="276" w:lineRule="auto"/>
+              <w:spacing w:line="240" w:lineRule="auto"/>
             </w:pPr>
             <w:r>
               <w:rPr>
@@ -1153,7 +1180,7 @@
         </w:tc>
         <w:tc>
           <w:tcPr>
-            <w:tcW w:w="4651" w:type="dxa"/>
+            <w:tcW w:w="4746" w:type="dxa"/>
             <w:shd w:val="clear" w:color="auto" w:fill="FFFFFF"/>
             <w:tcMar>
               <w:top w:w="90" w:type="dxa"/>
@@ -1164,7 +1191,7 @@
           </w:tcPr>
           <w:p>
             <w:pPr>
-              <w:spacing w:line="276" w:lineRule="auto"/>
+              <w:spacing w:line="240" w:lineRule="auto"/>
             </w:pPr>
             <w:r>
               <w:rPr>
@@ -1186,11 +1213,11 @@
           </w:tblCellMar>
         </w:tblPrEx>
         <w:trPr>
-          <w:trHeight w:val="100"/>
+          <w:trHeight w:val="121"/>
         </w:trPr>
         <w:tc>
           <w:tcPr>
-            <w:tcW w:w="2029" w:type="dxa"/>
+            <w:tcW w:w="2071" w:type="dxa"/>
             <w:shd w:val="clear" w:color="auto" w:fill="F2F4F7"/>
             <w:tcMar>
               <w:top w:w="90" w:type="dxa"/>
@@ -1201,7 +1228,7 @@
           </w:tcPr>
           <w:p>
             <w:pPr>
-              <w:spacing w:line="276" w:lineRule="auto"/>
+              <w:spacing w:line="240" w:lineRule="auto"/>
             </w:pPr>
             <w:r>
               <w:rPr>
@@ -1216,7 +1243,7 @@
         </w:tc>
         <w:tc>
           <w:tcPr>
-            <w:tcW w:w="3182" w:type="dxa"/>
+            <w:tcW w:w="3247" w:type="dxa"/>
             <w:shd w:val="clear" w:color="auto" w:fill="FFFFFF"/>
             <w:tcMar>
               <w:top w:w="90" w:type="dxa"/>
@@ -1227,7 +1254,7 @@
           </w:tcPr>
           <w:p>
             <w:pPr>
-              <w:spacing w:line="276" w:lineRule="auto"/>
+              <w:spacing w:line="240" w:lineRule="auto"/>
             </w:pPr>
             <w:r>
               <w:rPr>
@@ -1242,7 +1269,7 @@
         </w:tc>
         <w:tc>
           <w:tcPr>
-            <w:tcW w:w="4651" w:type="dxa"/>
+            <w:tcW w:w="4746" w:type="dxa"/>
             <w:shd w:val="clear" w:color="auto" w:fill="FFFFFF"/>
             <w:tcMar>
               <w:top w:w="90" w:type="dxa"/>
@@ -1253,7 +1280,7 @@
           </w:tcPr>
           <w:p>
             <w:pPr>
-              <w:spacing w:line="276" w:lineRule="auto"/>
+              <w:spacing w:line="240" w:lineRule="auto"/>
             </w:pPr>
             <w:r>
               <w:rPr>
@@ -1275,11 +1302,11 @@
           </w:tblCellMar>
         </w:tblPrEx>
         <w:trPr>
-          <w:trHeight w:val="77"/>
+          <w:trHeight w:val="94"/>
         </w:trPr>
         <w:tc>
           <w:tcPr>
-            <w:tcW w:w="2029" w:type="dxa"/>
+            <w:tcW w:w="2071" w:type="dxa"/>
             <w:shd w:val="clear" w:color="auto" w:fill="F2F4F7"/>
             <w:tcMar>
               <w:top w:w="90" w:type="dxa"/>
@@ -1290,7 +1317,7 @@
           </w:tcPr>
           <w:p>
             <w:pPr>
-              <w:spacing w:line="276" w:lineRule="auto"/>
+              <w:spacing w:line="240" w:lineRule="auto"/>
             </w:pPr>
             <w:r>
               <w:rPr>
@@ -1305,7 +1332,7 @@
         </w:tc>
         <w:tc>
           <w:tcPr>
-            <w:tcW w:w="3182" w:type="dxa"/>
+            <w:tcW w:w="3247" w:type="dxa"/>
             <w:shd w:val="clear" w:color="auto" w:fill="FFFFFF"/>
             <w:tcMar>
               <w:top w:w="90" w:type="dxa"/>
@@ -1316,7 +1343,7 @@
           </w:tcPr>
           <w:p>
             <w:pPr>
-              <w:spacing w:line="276" w:lineRule="auto"/>
+              <w:spacing w:line="240" w:lineRule="auto"/>
             </w:pPr>
             <w:r>
               <w:rPr>
@@ -1349,7 +1376,7 @@
         </w:tc>
         <w:tc>
           <w:tcPr>
-            <w:tcW w:w="4651" w:type="dxa"/>
+            <w:tcW w:w="4746" w:type="dxa"/>
             <w:shd w:val="clear" w:color="auto" w:fill="FFFFFF"/>
             <w:tcMar>
               <w:top w:w="90" w:type="dxa"/>
@@ -1360,7 +1387,7 @@
           </w:tcPr>
           <w:p>
             <w:pPr>
-              <w:spacing w:line="276" w:lineRule="auto"/>
+              <w:spacing w:line="240" w:lineRule="auto"/>
             </w:pPr>
             <w:r>
               <w:rPr>
@@ -1382,11 +1409,11 @@
           </w:tblCellMar>
         </w:tblPrEx>
         <w:trPr>
-          <w:trHeight w:val="77"/>
+          <w:trHeight w:val="94"/>
         </w:trPr>
         <w:tc>
           <w:tcPr>
-            <w:tcW w:w="2029" w:type="dxa"/>
+            <w:tcW w:w="2071" w:type="dxa"/>
             <w:shd w:val="clear" w:color="auto" w:fill="F2F4F7"/>
             <w:tcMar>
               <w:top w:w="90" w:type="dxa"/>
@@ -1397,7 +1424,7 @@
           </w:tcPr>
           <w:p>
             <w:pPr>
-              <w:spacing w:line="276" w:lineRule="auto"/>
+              <w:spacing w:line="240" w:lineRule="auto"/>
             </w:pPr>
             <w:r>
               <w:rPr>
@@ -1412,7 +1439,7 @@
         </w:tc>
         <w:tc>
           <w:tcPr>
-            <w:tcW w:w="3182" w:type="dxa"/>
+            <w:tcW w:w="3247" w:type="dxa"/>
             <w:shd w:val="clear" w:color="auto" w:fill="FFFFFF"/>
             <w:tcMar>
               <w:top w:w="90" w:type="dxa"/>
@@ -1423,7 +1450,7 @@
           </w:tcPr>
           <w:p>
             <w:pPr>
-              <w:spacing w:line="276" w:lineRule="auto"/>
+              <w:spacing w:line="240" w:lineRule="auto"/>
             </w:pPr>
             <w:r>
               <w:rPr>
@@ -1438,7 +1465,7 @@
         </w:tc>
         <w:tc>
           <w:tcPr>
-            <w:tcW w:w="4651" w:type="dxa"/>
+            <w:tcW w:w="4746" w:type="dxa"/>
             <w:shd w:val="clear" w:color="auto" w:fill="FFFFFF"/>
             <w:tcMar>
               <w:top w:w="90" w:type="dxa"/>
@@ -1449,7 +1476,7 @@
           </w:tcPr>
           <w:p>
             <w:pPr>
-              <w:spacing w:line="276" w:lineRule="auto"/>
+              <w:spacing w:line="240" w:lineRule="auto"/>
             </w:pPr>
             <w:r>
               <w:rPr>
@@ -1485,7 +1512,7 @@
     <w:p>
       <w:pPr>
         <w:pStyle w:val="Heading2"/>
-        <w:spacing w:before="200" w:after="100" w:line="276" w:lineRule="auto"/>
+        <w:spacing w:before="200" w:after="100" w:line="240" w:lineRule="auto"/>
       </w:pPr>
       <w:r>
         <w:rPr>
@@ -1501,7 +1528,7 @@
     </w:p>
     <w:p>
       <w:pPr>
-        <w:spacing w:line="276" w:lineRule="auto"/>
+        <w:spacing w:line="240" w:lineRule="auto"/>
       </w:pPr>
       <w:r>
         <w:rPr>
@@ -1590,29 +1617,15 @@
       </w:tblGrid>
       <w:tr>
         <w:trPr>
-          <w:trHeight w:val="467"/>
+          <w:trHeight w:val="323"/>
         </w:trPr>
         <w:tc>
           <w:tcPr>
             <w:tcW w:w="4963" w:type="dxa"/>
-            <w:shd w:val="clear" w:color="auto" w:fill="E97132" w:themeFill="accent2"/>
+            <w:shd w:val="clear" w:color="auto" w:fill="ADADAD" w:themeFill="background2" w:themeFillShade="BF"/>
           </w:tcPr>
           <w:p>
             <w:pPr>
-              <w:spacing w:line="276" w:lineRule="auto"/>
-              <w:rPr>
-                <w:rFonts w:ascii="Calibri" w:eastAsia="Calibri" w:hAnsi="Calibri" w:cs="Calibri"/>
-                <w:b/>
-                <w:bCs/>
-                <w:color w:val="FFFFFF"/>
-                <w:sz w:val="20"/>
-                <w:szCs w:val="20"/>
-              </w:rPr>
-            </w:pPr>
-          </w:p>
-          <w:p>
-            <w:pPr>
-              <w:spacing w:line="276" w:lineRule="auto"/>
               <w:jc w:val="center"/>
             </w:pPr>
             <w:r>
@@ -1631,25 +1644,10 @@
         <w:tc>
           <w:tcPr>
             <w:tcW w:w="4868" w:type="dxa"/>
-            <w:shd w:val="clear" w:color="auto" w:fill="E97132" w:themeFill="accent2"/>
+            <w:shd w:val="clear" w:color="auto" w:fill="ADADAD" w:themeFill="background2" w:themeFillShade="BF"/>
           </w:tcPr>
           <w:p>
             <w:pPr>
-              <w:spacing w:line="276" w:lineRule="auto"/>
-              <w:jc w:val="center"/>
-              <w:rPr>
-                <w:rFonts w:ascii="Calibri" w:eastAsia="Calibri" w:hAnsi="Calibri" w:cs="Calibri"/>
-                <w:b/>
-                <w:bCs/>
-                <w:color w:val="FFFFFF"/>
-                <w:sz w:val="20"/>
-                <w:szCs w:val="20"/>
-              </w:rPr>
-            </w:pPr>
-          </w:p>
-          <w:p>
-            <w:pPr>
-              <w:spacing w:line="276" w:lineRule="auto"/>
               <w:jc w:val="center"/>
             </w:pPr>
             <w:r>
@@ -1681,7 +1679,7 @@
                 <w:ilvl w:val="0"/>
                 <w:numId w:val="6"/>
               </w:numPr>
-              <w:spacing w:after="70" w:line="276" w:lineRule="auto"/>
+              <w:spacing w:after="70"/>
               <w:ind w:left="60" w:hanging="180"/>
             </w:pPr>
             <w:r>
@@ -1691,7 +1689,6 @@
                 <w:sz w:val="19"/>
                 <w:szCs w:val="19"/>
               </w:rPr>
-              <w:lastRenderedPageBreak/>
               <w:t>Finance: general ledger, accounts payable and receivable, multi-entity consolidation, USD and CAD multi-currency</w:t>
             </w:r>
           </w:p>
@@ -1702,7 +1699,7 @@
                 <w:ilvl w:val="0"/>
                 <w:numId w:val="6"/>
               </w:numPr>
-              <w:spacing w:after="70" w:line="276" w:lineRule="auto"/>
+              <w:spacing w:after="70"/>
               <w:ind w:left="60" w:hanging="180"/>
             </w:pPr>
             <w:r>
@@ -1740,7 +1737,7 @@
                 <w:ilvl w:val="0"/>
                 <w:numId w:val="6"/>
               </w:numPr>
-              <w:spacing w:after="70" w:line="276" w:lineRule="auto"/>
+              <w:spacing w:after="70"/>
               <w:ind w:left="60" w:hanging="180"/>
             </w:pPr>
             <w:r>
@@ -1760,7 +1757,7 @@
                 <w:ilvl w:val="0"/>
                 <w:numId w:val="6"/>
               </w:numPr>
-              <w:spacing w:after="70" w:line="276" w:lineRule="auto"/>
+              <w:spacing w:after="70"/>
               <w:ind w:left="60" w:hanging="180"/>
             </w:pPr>
             <w:r>
@@ -1789,7 +1786,7 @@
                 <w:ilvl w:val="0"/>
                 <w:numId w:val="6"/>
               </w:numPr>
-              <w:spacing w:after="70" w:line="276" w:lineRule="auto"/>
+              <w:spacing w:after="70"/>
               <w:ind w:left="60" w:hanging="180"/>
             </w:pPr>
             <w:r>
@@ -1814,7 +1811,7 @@
                 <w:ilvl w:val="0"/>
                 <w:numId w:val="1"/>
               </w:numPr>
-              <w:spacing w:after="70" w:line="276" w:lineRule="auto"/>
+              <w:spacing w:after="70"/>
               <w:ind w:left="0" w:firstLine="0"/>
               <w:contextualSpacing w:val="0"/>
             </w:pPr>
@@ -1835,7 +1832,7 @@
                 <w:ilvl w:val="0"/>
                 <w:numId w:val="1"/>
               </w:numPr>
-              <w:spacing w:after="70" w:line="276" w:lineRule="auto"/>
+              <w:spacing w:after="70"/>
               <w:ind w:left="170" w:hanging="170"/>
               <w:contextualSpacing w:val="0"/>
             </w:pPr>
@@ -1856,7 +1853,7 @@
                 <w:ilvl w:val="0"/>
                 <w:numId w:val="1"/>
               </w:numPr>
-              <w:spacing w:after="70" w:line="276" w:lineRule="auto"/>
+              <w:spacing w:after="70"/>
               <w:ind w:left="170" w:hanging="170"/>
               <w:contextualSpacing w:val="0"/>
             </w:pPr>
@@ -1871,9 +1868,6 @@
             </w:r>
           </w:p>
           <w:p>
-            <w:pPr>
-              <w:spacing w:line="276" w:lineRule="auto"/>
-            </w:pPr>
             <w:r>
               <w:rPr>
                 <w:rFonts w:ascii="Calibri" w:eastAsia="Calibri" w:hAnsi="Calibri" w:cs="Calibri"/>
@@ -1890,7 +1884,7 @@
     <w:p>
       <w:pPr>
         <w:pStyle w:val="Heading2"/>
-        <w:spacing w:before="200" w:after="100" w:line="276" w:lineRule="auto"/>
+        <w:spacing w:before="200" w:after="100" w:line="240" w:lineRule="auto"/>
       </w:pPr>
       <w:r>
         <w:rPr>
@@ -1901,12 +1895,13 @@
           <w:sz w:val="23"/>
           <w:szCs w:val="23"/>
         </w:rPr>
+        <w:lastRenderedPageBreak/>
         <w:t>Migration Exclusions and Customization Discipline</w:t>
       </w:r>
     </w:p>
     <w:p>
       <w:pPr>
-        <w:spacing w:line="276" w:lineRule="auto"/>
+        <w:spacing w:line="240" w:lineRule="auto"/>
       </w:pPr>
       <w:r>
         <w:rPr>
@@ -1956,7 +1951,7 @@
     </w:p>
     <w:p>
       <w:pPr>
-        <w:spacing w:line="276" w:lineRule="auto"/>
+        <w:spacing w:line="240" w:lineRule="auto"/>
       </w:pPr>
       <w:r>
         <w:rPr>
@@ -1983,13 +1978,33 @@
           <w:sz w:val="22"/>
           <w:szCs w:val="22"/>
         </w:rPr>
-        <w:t xml:space="preserve"> treats custom code as a last resort. Any customization request must show which of the three program objectives it serves before it is approved. This keeps the system upgradeable and keeps the twelve-month timeline realistic.</w:t>
+        <w:t xml:space="preserve"> treats custom code as a last resort. Any customization request must show which of the </w:t>
+      </w:r>
+      <w:proofErr w:type="gramStart"/>
+      <w:r>
+        <w:rPr>
+          <w:rFonts w:ascii="Calibri" w:eastAsia="Calibri" w:hAnsi="Calibri" w:cs="Calibri"/>
+          <w:color w:val="222222"/>
+          <w:sz w:val="22"/>
+          <w:szCs w:val="22"/>
+        </w:rPr>
+        <w:t>three program</w:t>
+      </w:r>
+      <w:proofErr w:type="gramEnd"/>
+      <w:r>
+        <w:rPr>
+          <w:rFonts w:ascii="Calibri" w:eastAsia="Calibri" w:hAnsi="Calibri" w:cs="Calibri"/>
+          <w:color w:val="222222"/>
+          <w:sz w:val="22"/>
+          <w:szCs w:val="22"/>
+        </w:rPr>
+        <w:t xml:space="preserve"> objectives it serves before it is approved. This keeps the system upgradeable and keeps the twelve-month timeline realistic.</w:t>
       </w:r>
     </w:p>
     <w:p>
       <w:pPr>
         <w:pStyle w:val="Heading1"/>
-        <w:spacing w:before="320" w:after="140" w:line="276" w:lineRule="auto"/>
+        <w:spacing w:before="320" w:after="140" w:line="240" w:lineRule="auto"/>
       </w:pPr>
       <w:r>
         <w:rPr>
@@ -2006,7 +2021,7 @@
     <w:p>
       <w:pPr>
         <w:pStyle w:val="Heading2"/>
-        <w:spacing w:before="200" w:after="100" w:line="276" w:lineRule="auto"/>
+        <w:spacing w:before="200" w:after="100" w:line="240" w:lineRule="auto"/>
       </w:pPr>
       <w:r>
         <w:rPr>
@@ -2022,7 +2037,7 @@
     </w:p>
     <w:p>
       <w:pPr>
-        <w:spacing w:line="276" w:lineRule="auto"/>
+        <w:spacing w:line="240" w:lineRule="auto"/>
       </w:pPr>
       <w:r>
         <w:rPr>
@@ -2055,7 +2070,7 @@
     <w:p>
       <w:pPr>
         <w:pStyle w:val="Heading2"/>
-        <w:spacing w:before="200" w:after="100" w:line="276" w:lineRule="auto"/>
+        <w:spacing w:before="200" w:after="100" w:line="240" w:lineRule="auto"/>
       </w:pPr>
       <w:r>
         <w:rPr>
@@ -2071,7 +2086,7 @@
     </w:p>
     <w:p>
       <w:pPr>
-        <w:spacing w:line="276" w:lineRule="auto"/>
+        <w:spacing w:line="240" w:lineRule="auto"/>
       </w:pPr>
       <w:r>
         <w:rPr>
@@ -2104,7 +2119,7 @@
     <w:p>
       <w:pPr>
         <w:pStyle w:val="Heading2"/>
-        <w:spacing w:before="200" w:after="100" w:line="276" w:lineRule="auto"/>
+        <w:spacing w:before="200" w:after="100" w:line="240" w:lineRule="auto"/>
       </w:pPr>
       <w:r>
         <w:rPr>
@@ -2120,7 +2135,7 @@
     </w:p>
     <w:p>
       <w:pPr>
-        <w:spacing w:line="276" w:lineRule="auto"/>
+        <w:spacing w:line="240" w:lineRule="auto"/>
       </w:pPr>
       <w:r>
         <w:rPr>
@@ -2135,7 +2150,7 @@
     <w:p>
       <w:pPr>
         <w:pStyle w:val="Heading1"/>
-        <w:spacing w:before="320" w:after="140" w:line="276" w:lineRule="auto"/>
+        <w:spacing w:before="320" w:after="140" w:line="240" w:lineRule="auto"/>
       </w:pPr>
       <w:r>
         <w:rPr>
@@ -2146,14 +2161,13 @@
           <w:sz w:val="27"/>
           <w:szCs w:val="27"/>
         </w:rPr>
-        <w:lastRenderedPageBreak/>
         <w:t>4. Why This Holds Up in Practice</w:t>
       </w:r>
     </w:p>
     <w:p>
       <w:pPr>
         <w:pStyle w:val="Heading2"/>
-        <w:spacing w:before="200" w:after="100" w:line="276" w:lineRule="auto"/>
+        <w:spacing w:before="200" w:after="100" w:line="240" w:lineRule="auto"/>
       </w:pPr>
       <w:r>
         <w:rPr>
@@ -2169,7 +2183,7 @@
     </w:p>
     <w:p>
       <w:pPr>
-        <w:spacing w:line="276" w:lineRule="auto"/>
+        <w:spacing w:line="240" w:lineRule="auto"/>
       </w:pPr>
       <w:r>
         <w:rPr>
@@ -2196,13 +2210,33 @@
           <w:sz w:val="22"/>
           <w:szCs w:val="22"/>
         </w:rPr>
-        <w:t>, parallel-run structure in this memo is not a theoretical preference. It is a direct response to how ERP cutovers actually fail in practice. Hershey's 1999 SAP implementation is a widely taught case precisely because the company compressed testing and skipped a genuine parallel run to hit a deadline, and the company was unable to process and ship enough product during its peak Halloween and Christmas season as a result. Revlon's 2018 ERP go-live is another widely reported example: production and shipping disruptions followed a cutover that outpaced the organization's ability to validate data and processes before relying on the new system. Both cases follow the same pattern: schedule pressure overriding validation. The phased structure in Section 1, and the requirement for two full parallel closes in Section 3, exist specifically to prevent AMG from repeating that pattern.</w:t>
+        <w:t xml:space="preserve">, parallel-run structure in this memo is not a theoretical preference. It is a direct response to how ERP cutovers </w:t>
+      </w:r>
+      <w:proofErr w:type="gramStart"/>
+      <w:r>
+        <w:rPr>
+          <w:rFonts w:ascii="Calibri" w:eastAsia="Calibri" w:hAnsi="Calibri" w:cs="Calibri"/>
+          <w:color w:val="222222"/>
+          <w:sz w:val="22"/>
+          <w:szCs w:val="22"/>
+        </w:rPr>
+        <w:t>actually fail</w:t>
+      </w:r>
+      <w:proofErr w:type="gramEnd"/>
+      <w:r>
+        <w:rPr>
+          <w:rFonts w:ascii="Calibri" w:eastAsia="Calibri" w:hAnsi="Calibri" w:cs="Calibri"/>
+          <w:color w:val="222222"/>
+          <w:sz w:val="22"/>
+          <w:szCs w:val="22"/>
+        </w:rPr>
+        <w:t xml:space="preserve"> in practice. Hershey's 1999 SAP implementation is a widely taught case precisely because the company compressed testing and skipped a genuine parallel run to hit a deadline, and the company was unable to process and ship enough product during its peak Halloween and Christmas season as a result. Revlon's 2018 ERP go-live is another widely reported example: production and shipping disruptions followed a cutover that outpaced the organization's ability to validate data and processes before relying on the new system. Both cases follow the same pattern: schedule pressure overriding validation. The phased structure in Section 1, and the requirement for two full parallel closes in Section 3, exist specifically to prevent AMG from repeating that pattern.</w:t>
       </w:r>
     </w:p>
     <w:p>
       <w:pPr>
         <w:pStyle w:val="Heading2"/>
-        <w:spacing w:before="200" w:after="100" w:line="276" w:lineRule="auto"/>
+        <w:spacing w:before="200" w:after="100" w:line="240" w:lineRule="auto"/>
       </w:pPr>
       <w:r>
         <w:rPr>
@@ -2213,12 +2247,13 @@
           <w:sz w:val="23"/>
           <w:szCs w:val="23"/>
         </w:rPr>
+        <w:lastRenderedPageBreak/>
         <w:t>A Concrete Technical Path for Data Continuity</w:t>
       </w:r>
     </w:p>
     <w:p>
       <w:pPr>
-        <w:spacing w:line="276" w:lineRule="auto"/>
+        <w:spacing w:line="240" w:lineRule="auto"/>
         <w:rPr>
           <w:rFonts w:ascii="Calibri" w:eastAsia="Calibri" w:hAnsi="Calibri" w:cs="Calibri"/>
           <w:color w:val="222222"/>
@@ -2272,7 +2307,7 @@
         <w:tc>
           <w:tcPr>
             <w:tcW w:w="2394" w:type="dxa"/>
-            <w:shd w:val="clear" w:color="auto" w:fill="E97132" w:themeFill="accent2"/>
+            <w:shd w:val="clear" w:color="auto" w:fill="ADADAD" w:themeFill="background2" w:themeFillShade="BF"/>
             <w:tcMar>
               <w:top w:w="90" w:type="dxa"/>
               <w:left w:w="110" w:type="dxa"/>
@@ -2282,7 +2317,8 @@
           </w:tcPr>
           <w:p>
             <w:pPr>
-              <w:spacing w:line="276" w:lineRule="auto"/>
+              <w:spacing w:line="240" w:lineRule="auto"/>
+              <w:jc w:val="center"/>
             </w:pPr>
             <w:r>
               <w:rPr>
@@ -2300,7 +2336,7 @@
         <w:tc>
           <w:tcPr>
             <w:tcW w:w="2394" w:type="dxa"/>
-            <w:shd w:val="clear" w:color="auto" w:fill="E97132" w:themeFill="accent2"/>
+            <w:shd w:val="clear" w:color="auto" w:fill="ADADAD" w:themeFill="background2" w:themeFillShade="BF"/>
             <w:tcMar>
               <w:top w:w="90" w:type="dxa"/>
               <w:left w:w="110" w:type="dxa"/>
@@ -2310,7 +2346,8 @@
           </w:tcPr>
           <w:p>
             <w:pPr>
-              <w:spacing w:line="276" w:lineRule="auto"/>
+              <w:spacing w:line="240" w:lineRule="auto"/>
+              <w:jc w:val="center"/>
             </w:pPr>
             <w:r>
               <w:rPr>
@@ -2328,7 +2365,7 @@
         <w:tc>
           <w:tcPr>
             <w:tcW w:w="4657" w:type="dxa"/>
-            <w:shd w:val="clear" w:color="auto" w:fill="E97132" w:themeFill="accent2"/>
+            <w:shd w:val="clear" w:color="auto" w:fill="ADADAD" w:themeFill="background2" w:themeFillShade="BF"/>
             <w:tcMar>
               <w:top w:w="90" w:type="dxa"/>
               <w:left w:w="110" w:type="dxa"/>
@@ -2338,7 +2375,8 @@
           </w:tcPr>
           <w:p>
             <w:pPr>
-              <w:spacing w:line="276" w:lineRule="auto"/>
+              <w:spacing w:line="240" w:lineRule="auto"/>
+              <w:jc w:val="center"/>
             </w:pPr>
             <w:r>
               <w:rPr>
@@ -2377,7 +2415,7 @@
           </w:tcPr>
           <w:p>
             <w:pPr>
-              <w:spacing w:line="276" w:lineRule="auto"/>
+              <w:spacing w:line="240" w:lineRule="auto"/>
             </w:pPr>
             <w:r>
               <w:rPr>
@@ -2403,7 +2441,7 @@
           </w:tcPr>
           <w:p>
             <w:pPr>
-              <w:spacing w:line="276" w:lineRule="auto"/>
+              <w:spacing w:line="240" w:lineRule="auto"/>
             </w:pPr>
             <w:r>
               <w:rPr>
@@ -2429,7 +2467,7 @@
           </w:tcPr>
           <w:p>
             <w:pPr>
-              <w:spacing w:line="276" w:lineRule="auto"/>
+              <w:spacing w:line="240" w:lineRule="auto"/>
             </w:pPr>
             <w:r>
               <w:rPr>
@@ -2466,7 +2504,7 @@
           </w:tcPr>
           <w:p>
             <w:pPr>
-              <w:spacing w:line="276" w:lineRule="auto"/>
+              <w:spacing w:line="240" w:lineRule="auto"/>
             </w:pPr>
             <w:r>
               <w:rPr>
@@ -2492,7 +2530,7 @@
           </w:tcPr>
           <w:p>
             <w:pPr>
-              <w:spacing w:line="276" w:lineRule="auto"/>
+              <w:spacing w:line="240" w:lineRule="auto"/>
             </w:pPr>
             <w:r>
               <w:rPr>
@@ -2518,7 +2556,7 @@
           </w:tcPr>
           <w:p>
             <w:pPr>
-              <w:spacing w:line="276" w:lineRule="auto"/>
+              <w:spacing w:line="240" w:lineRule="auto"/>
             </w:pPr>
             <w:r>
               <w:rPr>
@@ -2527,7 +2565,27 @@
                 <w:sz w:val="20"/>
                 <w:szCs w:val="20"/>
               </w:rPr>
-              <w:t>Closed jobs and historical detail land in cheap, durable storage and stay queryable for audits and trend analysis without ever touching the live transactional database.</w:t>
+              <w:t xml:space="preserve">Closed jobs and historical detail land in cheap, durable storage and stay </w:t>
+            </w:r>
+            <w:proofErr w:type="spellStart"/>
+            <w:r>
+              <w:rPr>
+                <w:rFonts w:ascii="Calibri" w:eastAsia="Calibri" w:hAnsi="Calibri" w:cs="Calibri"/>
+                <w:color w:val="222222"/>
+                <w:sz w:val="20"/>
+                <w:szCs w:val="20"/>
+              </w:rPr>
+              <w:t>queryable</w:t>
+            </w:r>
+            <w:proofErr w:type="spellEnd"/>
+            <w:r>
+              <w:rPr>
+                <w:rFonts w:ascii="Calibri" w:eastAsia="Calibri" w:hAnsi="Calibri" w:cs="Calibri"/>
+                <w:color w:val="222222"/>
+                <w:sz w:val="20"/>
+                <w:szCs w:val="20"/>
+              </w:rPr>
+              <w:t xml:space="preserve"> for audits and trend analysis without ever touching the live transactional database.</w:t>
             </w:r>
           </w:p>
         </w:tc>
@@ -2555,7 +2613,7 @@
           </w:tcPr>
           <w:p>
             <w:pPr>
-              <w:spacing w:line="276" w:lineRule="auto"/>
+              <w:spacing w:line="240" w:lineRule="auto"/>
             </w:pPr>
             <w:r>
               <w:rPr>
@@ -2581,7 +2639,7 @@
           </w:tcPr>
           <w:p>
             <w:pPr>
-              <w:spacing w:line="276" w:lineRule="auto"/>
+              <w:spacing w:line="240" w:lineRule="auto"/>
             </w:pPr>
             <w:r>
               <w:rPr>
@@ -2607,7 +2665,7 @@
           </w:tcPr>
           <w:p>
             <w:pPr>
-              <w:spacing w:line="276" w:lineRule="auto"/>
+              <w:spacing w:line="240" w:lineRule="auto"/>
             </w:pPr>
             <w:r>
               <w:rPr>
@@ -2662,7 +2720,7 @@
           </w:tcPr>
           <w:p>
             <w:pPr>
-              <w:spacing w:line="276" w:lineRule="auto"/>
+              <w:spacing w:line="240" w:lineRule="auto"/>
             </w:pPr>
             <w:r>
               <w:rPr>
@@ -2688,7 +2746,7 @@
           </w:tcPr>
           <w:p>
             <w:pPr>
-              <w:spacing w:line="276" w:lineRule="auto"/>
+              <w:spacing w:line="240" w:lineRule="auto"/>
             </w:pPr>
             <w:r>
               <w:rPr>
@@ -2714,7 +2772,7 @@
           </w:tcPr>
           <w:p>
             <w:pPr>
-              <w:spacing w:line="276" w:lineRule="auto"/>
+              <w:spacing w:line="240" w:lineRule="auto"/>
             </w:pPr>
             <w:r>
               <w:rPr>
@@ -2731,12 +2789,12 @@
     </w:tbl>
     <w:p>
       <w:pPr>
-        <w:spacing w:line="276" w:lineRule="auto"/>
+        <w:spacing w:line="240" w:lineRule="auto"/>
       </w:pPr>
     </w:p>
     <w:p>
       <w:pPr>
-        <w:spacing w:line="276" w:lineRule="auto"/>
+        <w:spacing w:line="240" w:lineRule="auto"/>
       </w:pPr>
       <w:r>
         <w:rPr>
@@ -2751,7 +2809,7 @@
     <w:p>
       <w:pPr>
         <w:pStyle w:val="Heading1"/>
-        <w:spacing w:before="320" w:after="140" w:line="276" w:lineRule="auto"/>
+        <w:spacing w:before="320" w:after="140" w:line="240" w:lineRule="auto"/>
       </w:pPr>
       <w:r>
         <w:rPr>
@@ -2762,13 +2820,12 @@
           <w:sz w:val="27"/>
           <w:szCs w:val="27"/>
         </w:rPr>
-        <w:lastRenderedPageBreak/>
         <w:t>Recommendation and Requested Action</w:t>
       </w:r>
     </w:p>
     <w:p>
       <w:pPr>
-        <w:spacing w:line="276" w:lineRule="auto"/>
+        <w:spacing w:line="240" w:lineRule="auto"/>
       </w:pPr>
       <w:r>
         <w:rPr>

</xml_diff>